<commit_message>
Update pandoc reference doc
</commit_message>
<xml_diff>
--- a/misc/pandoc/reference.docx
+++ b/misc/pandoc/reference.docx
@@ -47,7 +47,7 @@
     <w:p>
       <w:pPr>
         <w:pStyle w:val="1"/>
-        <w:ind w:right="240"/>
+        <w:ind w:right="239"/>
       </w:pPr>
       <w:bookmarkStart w:id="0" w:name="heading-1"/>
       <w:r>
@@ -58,7 +58,7 @@
     <w:p>
       <w:pPr>
         <w:pStyle w:val="2"/>
-        <w:ind w:right="240" w:firstLine="241"/>
+        <w:ind w:right="239" w:firstLine="240"/>
       </w:pPr>
       <w:bookmarkStart w:id="1" w:name="heading-2"/>
       <w:r>
@@ -69,26 +69,23 @@
     <w:p>
       <w:pPr>
         <w:pStyle w:val="3"/>
-        <w:rPr>
-          <w:rFonts w:hint="eastAsia"/>
-        </w:rPr>
-      </w:pPr>
-      <w:bookmarkStart w:id="2" w:name="heading-4"/>
-      <w:bookmarkStart w:id="3" w:name="heading-3"/>
+      </w:pPr>
+      <w:bookmarkStart w:id="2" w:name="heading-3"/>
+      <w:bookmarkStart w:id="3" w:name="heading-4"/>
       <w:r>
         <w:t>Heading 3</w:t>
       </w:r>
+      <w:bookmarkEnd w:id="2"/>
+    </w:p>
+    <w:p>
+      <w:pPr>
+        <w:pStyle w:val="4"/>
+        <w:ind w:left="239" w:right="240"/>
+      </w:pPr>
+      <w:r>
+        <w:t>Heading 4</w:t>
+      </w:r>
       <w:bookmarkEnd w:id="3"/>
-    </w:p>
-    <w:p>
-      <w:pPr>
-        <w:pStyle w:val="4"/>
-        <w:ind w:left="240" w:right="240"/>
-      </w:pPr>
-      <w:r>
-        <w:t>Heading 4</w:t>
-      </w:r>
-      <w:bookmarkEnd w:id="2"/>
     </w:p>
     <w:p>
       <w:pPr>
@@ -104,7 +101,7 @@
     <w:p>
       <w:pPr>
         <w:pStyle w:val="6"/>
-        <w:ind w:left="300" w:right="240"/>
+        <w:ind w:left="299" w:right="240"/>
       </w:pPr>
       <w:bookmarkStart w:id="5" w:name="heading-6"/>
       <w:r>
@@ -126,7 +123,7 @@
     <w:p>
       <w:pPr>
         <w:pStyle w:val="8"/>
-        <w:ind w:left="300" w:right="240"/>
+        <w:ind w:left="299" w:right="239"/>
       </w:pPr>
       <w:bookmarkStart w:id="7" w:name="heading-8"/>
       <w:r>
@@ -137,7 +134,7 @@
     <w:p>
       <w:pPr>
         <w:pStyle w:val="9"/>
-        <w:ind w:left="60" w:right="240"/>
+        <w:ind w:left="60" w:right="239"/>
       </w:pPr>
       <w:bookmarkStart w:id="8" w:name="heading-9"/>
       <w:r>
@@ -148,7 +145,7 @@
     <w:p>
       <w:pPr>
         <w:pStyle w:val="FirstParagraph"/>
-        <w:ind w:firstLine="240"/>
+        <w:ind w:firstLine="239"/>
       </w:pPr>
       <w:r>
         <w:t>First Paragraph.</w:t>
@@ -157,7 +154,7 @@
     <w:p>
       <w:pPr>
         <w:pStyle w:val="a0"/>
-        <w:ind w:firstLine="240"/>
+        <w:ind w:firstLine="239"/>
       </w:pPr>
       <w:r>
         <w:t xml:space="preserve">Body Text. Body Text Char. </w:t>
@@ -192,7 +189,7 @@
     <w:p>
       <w:pPr>
         <w:pStyle w:val="aa"/>
-        <w:ind w:firstLine="240"/>
+        <w:ind w:firstLine="239"/>
       </w:pPr>
       <w:r>
         <w:t>Block Text.</w:t>
@@ -213,8 +210,8 @@
         <w:tblLook w:val="07E0" w:firstRow="1" w:lastRow="1" w:firstColumn="1" w:lastColumn="1" w:noHBand="1" w:noVBand="1"/>
       </w:tblPr>
       <w:tblGrid>
-        <w:gridCol w:w="763"/>
-        <w:gridCol w:w="763"/>
+        <w:gridCol w:w="758"/>
+        <w:gridCol w:w="758"/>
       </w:tblGrid>
       <w:tr>
         <w:trPr>
@@ -227,7 +224,7 @@
           <w:p>
             <w:pPr>
               <w:pStyle w:val="Compact"/>
-              <w:ind w:firstLine="240"/>
+              <w:ind w:firstLine="239"/>
             </w:pPr>
             <w:r>
               <w:t>Table</w:t>
@@ -241,7 +238,7 @@
           <w:p>
             <w:pPr>
               <w:pStyle w:val="Compact"/>
-              <w:ind w:firstLine="240"/>
+              <w:ind w:firstLine="239"/>
             </w:pPr>
             <w:r>
               <w:t>Table</w:t>
@@ -257,7 +254,7 @@
           <w:p>
             <w:pPr>
               <w:pStyle w:val="Compact"/>
-              <w:ind w:firstLine="240"/>
+              <w:ind w:firstLine="239"/>
             </w:pPr>
             <w:r>
               <w:t>1</w:t>
@@ -271,7 +268,7 @@
           <w:p>
             <w:pPr>
               <w:pStyle w:val="Compact"/>
-              <w:ind w:firstLine="240"/>
+              <w:ind w:firstLine="239"/>
             </w:pPr>
             <w:r>
               <w:t>2</w:t>
@@ -294,6 +291,7 @@
         <w:pStyle w:val="DefinitionTerm"/>
       </w:pPr>
       <w:r>
+        <w:lastRenderedPageBreak/>
         <w:t>DefinitionTerm</w:t>
       </w:r>
     </w:p>
@@ -321,10 +319,258 @@
         <w:t>Definition</w:t>
       </w:r>
     </w:p>
+    <w:p>
+      <w:pPr>
+        <w:pStyle w:val="Definition"/>
+      </w:pPr>
+      <w:r>
+        <w:rPr>
+          <w:rFonts w:hint="eastAsia"/>
+        </w:rPr>
+        <w:t>あああああいいいいいうううううえええええおおおおおかかかかかきききききくく</w:t>
+      </w:r>
+    </w:p>
+    <w:p>
+      <w:pPr>
+        <w:pStyle w:val="Definition"/>
+      </w:pPr>
+      <w:r>
+        <w:rPr>
+          <w:rFonts w:hint="eastAsia"/>
+        </w:rPr>
+        <w:t>い</w:t>
+      </w:r>
+    </w:p>
+    <w:p>
+      <w:pPr>
+        <w:pStyle w:val="Definition"/>
+      </w:pPr>
+      <w:r>
+        <w:rPr>
+          <w:rFonts w:hint="eastAsia"/>
+        </w:rPr>
+        <w:t>う</w:t>
+      </w:r>
+    </w:p>
+    <w:p>
+      <w:pPr>
+        <w:pStyle w:val="Definition"/>
+      </w:pPr>
+      <w:r>
+        <w:rPr>
+          <w:rFonts w:hint="eastAsia"/>
+        </w:rPr>
+        <w:t>え</w:t>
+      </w:r>
+    </w:p>
+    <w:p>
+      <w:pPr>
+        <w:pStyle w:val="Definition"/>
+      </w:pPr>
+      <w:r>
+        <w:rPr>
+          <w:rFonts w:hint="eastAsia"/>
+        </w:rPr>
+        <w:t>お</w:t>
+      </w:r>
+    </w:p>
+    <w:p>
+      <w:pPr>
+        <w:pStyle w:val="Definition"/>
+      </w:pPr>
+      <w:r>
+        <w:rPr>
+          <w:rFonts w:hint="eastAsia"/>
+        </w:rPr>
+        <w:t>か</w:t>
+      </w:r>
+    </w:p>
+    <w:p>
+      <w:pPr>
+        <w:pStyle w:val="Definition"/>
+      </w:pPr>
+      <w:r>
+        <w:rPr>
+          <w:rFonts w:hint="eastAsia"/>
+        </w:rPr>
+        <w:t>き</w:t>
+      </w:r>
+    </w:p>
+    <w:p>
+      <w:pPr>
+        <w:pStyle w:val="Definition"/>
+      </w:pPr>
+      <w:r>
+        <w:rPr>
+          <w:rFonts w:hint="eastAsia"/>
+        </w:rPr>
+        <w:t>く</w:t>
+      </w:r>
+    </w:p>
+    <w:p>
+      <w:pPr>
+        <w:pStyle w:val="Definition"/>
+      </w:pPr>
+      <w:r>
+        <w:rPr>
+          <w:rFonts w:hint="eastAsia"/>
+        </w:rPr>
+        <w:t>け</w:t>
+      </w:r>
+    </w:p>
+    <w:p>
+      <w:pPr>
+        <w:pStyle w:val="Definition"/>
+      </w:pPr>
+      <w:r>
+        <w:rPr>
+          <w:rFonts w:hint="eastAsia"/>
+        </w:rPr>
+        <w:t>こ</w:t>
+      </w:r>
+    </w:p>
+    <w:p>
+      <w:pPr>
+        <w:pStyle w:val="Definition"/>
+      </w:pPr>
+      <w:r>
+        <w:rPr>
+          <w:rFonts w:hint="eastAsia"/>
+        </w:rPr>
+        <w:t>さ</w:t>
+      </w:r>
+    </w:p>
+    <w:p>
+      <w:pPr>
+        <w:pStyle w:val="Definition"/>
+      </w:pPr>
+      <w:r>
+        <w:rPr>
+          <w:rFonts w:hint="eastAsia"/>
+        </w:rPr>
+        <w:t>し</w:t>
+      </w:r>
+    </w:p>
+    <w:p>
+      <w:pPr>
+        <w:pStyle w:val="Definition"/>
+      </w:pPr>
+      <w:r>
+        <w:rPr>
+          <w:rFonts w:hint="eastAsia"/>
+        </w:rPr>
+        <w:t>す</w:t>
+      </w:r>
+    </w:p>
+    <w:p>
+      <w:pPr>
+        <w:pStyle w:val="Definition"/>
+      </w:pPr>
+      <w:r>
+        <w:rPr>
+          <w:rFonts w:hint="eastAsia"/>
+        </w:rPr>
+        <w:t>せ</w:t>
+      </w:r>
+    </w:p>
+    <w:p>
+      <w:pPr>
+        <w:pStyle w:val="Definition"/>
+      </w:pPr>
+      <w:r>
+        <w:rPr>
+          <w:rFonts w:hint="eastAsia"/>
+        </w:rPr>
+        <w:t>そ</w:t>
+      </w:r>
+    </w:p>
+    <w:p>
+      <w:pPr>
+        <w:pStyle w:val="Definition"/>
+      </w:pPr>
+      <w:r>
+        <w:rPr>
+          <w:rFonts w:hint="eastAsia"/>
+        </w:rPr>
+        <w:t>た</w:t>
+      </w:r>
+    </w:p>
+    <w:p>
+      <w:pPr>
+        <w:pStyle w:val="Definition"/>
+      </w:pPr>
+      <w:r>
+        <w:rPr>
+          <w:rFonts w:hint="eastAsia"/>
+        </w:rPr>
+        <w:t>ち</w:t>
+      </w:r>
+    </w:p>
+    <w:p>
+      <w:pPr>
+        <w:pStyle w:val="Definition"/>
+      </w:pPr>
+      <w:r>
+        <w:rPr>
+          <w:rFonts w:hint="eastAsia"/>
+        </w:rPr>
+        <w:t>つ</w:t>
+      </w:r>
+    </w:p>
+    <w:p>
+      <w:pPr>
+        <w:pStyle w:val="Definition"/>
+      </w:pPr>
+      <w:r>
+        <w:rPr>
+          <w:rFonts w:hint="eastAsia"/>
+        </w:rPr>
+        <w:t>て</w:t>
+      </w:r>
+    </w:p>
+    <w:p>
+      <w:pPr>
+        <w:pStyle w:val="Definition"/>
+      </w:pPr>
+      <w:r>
+        <w:rPr>
+          <w:rFonts w:hint="eastAsia"/>
+        </w:rPr>
+        <w:t>と</w:t>
+      </w:r>
+    </w:p>
+    <w:p>
+      <w:pPr>
+        <w:pStyle w:val="Definition"/>
+      </w:pPr>
+      <w:r>
+        <w:rPr>
+          <w:rFonts w:hint="eastAsia"/>
+        </w:rPr>
+        <w:t>な</w:t>
+      </w:r>
+    </w:p>
+    <w:p>
+      <w:pPr>
+        <w:pStyle w:val="Definition"/>
+        <w:rPr>
+          <w:rFonts w:hint="eastAsia"/>
+        </w:rPr>
+      </w:pPr>
+      <w:r>
+        <w:rPr>
+          <w:rFonts w:hint="eastAsia"/>
+        </w:rPr>
+        <w:t>に</w:t>
+      </w:r>
+    </w:p>
     <w:sectPr>
-      <w:pgSz w:w="12240" w:h="15840"/>
-      <w:pgMar w:top="1985" w:right="1701" w:bottom="1701" w:left="1701" w:header="720" w:footer="720" w:gutter="0"/>
+      <w:pgSz w:w="11906" w:h="16838" w:code="9"/>
+      <w:pgMar w:top="1985" w:right="1531" w:bottom="1531" w:left="1531" w:header="720" w:footer="720" w:gutter="0"/>
+      <w:lnNumType w:countBy="5"/>
       <w:cols w:space="720"/>
+      <w:titlePg/>
+      <w:docGrid w:type="linesAndChars" w:linePitch="512" w:charSpace="-200"/>
     </w:sectPr>
   </w:body>
 </w:document>
@@ -2311,6 +2557,11 @@
       <w:color w:val="0F4761" w:themeColor="accent1" w:themeShade="BF"/>
     </w:rPr>
   </w:style>
+  <w:style w:type="character" w:styleId="af1">
+    <w:name w:val="line number"/>
+    <w:basedOn w:val="a1"/>
+    <w:rsid w:val="000475D5"/>
+  </w:style>
 </w:styles>
 </file>
 

</xml_diff>